<commit_message>
- system design document - updated drawio designs
</commit_message>
<xml_diff>
--- a/04_System_Design_and_Development/Chapter_4_System_Design_and_Development.docx
+++ b/04_System_Design_and_Development/Chapter_4_System_Design_and_Development.docx
@@ -234,17 +234,12 @@
     </w:p>
     <w:p>
       <w:r>
-        <w:t>________________________________________________________________________________</w:t>
+        <w:t>This chapter shows how we turned Chapter 3 requirements into a working design and what we built in the development sprint. TrackWIL replaces the PDF and email logbook with a small web-app. Students log workplace hours, the employer checks and entry through a link and does not need an account to do so. The WIL coordinator can see who is on track, who is waiting on a mentor, and who is overdue.</w:t>
       </w:r>
     </w:p>
     <w:p>
       <w:r>
-        <w:t>________________________________________________________________________________</w:t>
-      </w:r>
-    </w:p>
-    <w:p>
-      <w:r>
-        <w:t>________________________________________________________________________________</w:t>
+        <w:t>For week 3 we drew the architecture, UML, and database design. We built the app at the same time. The code in `05_Source_Control/trackwil` covers the three core features from the proposal.</w:t>
       </w:r>
     </w:p>
     <w:p>
@@ -262,34 +257,331 @@
     </w:p>
     <w:p>
       <w:r>
-        <w:t>________________________________________________________________________________</w:t>
+        <w:t>TrackWIL is a Next.js application. The browser talks to a single Node.js process. That process serves the React pages, runs the business logic, and reads and writes to the JSON database. Uploaded evidence sits on disk.</w:t>
       </w:r>
     </w:p>
     <w:p>
       <w:r>
-        <w:t>________________________________________________________________________________</w:t>
+        <w:t>Main components:</w:t>
+      </w:r>
+    </w:p>
+    <w:tbl>
+      <w:tblPr>
+        <w:tblStyle w:val="TableGrid"/>
+        <w:tblW w:w="0" w:type="auto"/>
+        <w:tblLook w:val="04A0" w:firstRow="1" w:lastRow="0" w:firstColumn="1" w:lastColumn="0" w:noHBand="0" w:noVBand="1"/>
+      </w:tblPr>
+      <w:tblGrid>
+        <w:gridCol w:w="4981"/>
+        <w:gridCol w:w="4981"/>
+      </w:tblGrid>
+      <w:tr>
+        <w:trPr>
+          <w:trHeight w:val="510"/>
+        </w:trPr>
+        <w:tc>
+          <w:tcPr>
+            <w:tcW w:w="4981" w:type="dxa"/>
+            <w:vAlign w:val="center"/>
+          </w:tcPr>
+          <w:p>
+            <w:pPr>
+              <w:rPr>
+                <w:b/>
+                <w:bCs/>
+              </w:rPr>
+            </w:pPr>
+            <w:r>
+              <w:rPr>
+                <w:b/>
+                <w:bCs/>
+              </w:rPr>
+              <w:t>Component</w:t>
+            </w:r>
+          </w:p>
+        </w:tc>
+        <w:tc>
+          <w:tcPr>
+            <w:tcW w:w="4981" w:type="dxa"/>
+            <w:vAlign w:val="center"/>
+          </w:tcPr>
+          <w:p>
+            <w:pPr>
+              <w:rPr>
+                <w:b/>
+                <w:bCs/>
+              </w:rPr>
+            </w:pPr>
+            <w:r>
+              <w:rPr>
+                <w:b/>
+                <w:bCs/>
+              </w:rPr>
+              <w:t>Responsibility</w:t>
+            </w:r>
+          </w:p>
+        </w:tc>
+      </w:tr>
+      <w:tr>
+        <w:trPr>
+          <w:trHeight w:val="510"/>
+        </w:trPr>
+        <w:tc>
+          <w:tcPr>
+            <w:tcW w:w="4981" w:type="dxa"/>
+            <w:vAlign w:val="center"/>
+          </w:tcPr>
+          <w:p>
+            <w:r>
+              <w:t>Student area</w:t>
+            </w:r>
+          </w:p>
+        </w:tc>
+        <w:tc>
+          <w:tcPr>
+            <w:tcW w:w="4981" w:type="dxa"/>
+            <w:vAlign w:val="center"/>
+          </w:tcPr>
+          <w:p>
+            <w:r>
+              <w:t>Dashboard, new entries, evidence, sharing</w:t>
+            </w:r>
+          </w:p>
+        </w:tc>
+      </w:tr>
+      <w:tr>
+        <w:trPr>
+          <w:trHeight w:val="510"/>
+        </w:trPr>
+        <w:tc>
+          <w:tcPr>
+            <w:tcW w:w="4981" w:type="dxa"/>
+            <w:vAlign w:val="center"/>
+          </w:tcPr>
+          <w:p>
+            <w:r>
+              <w:t>Coordinator area</w:t>
+            </w:r>
+          </w:p>
+        </w:tc>
+        <w:tc>
+          <w:tcPr>
+            <w:tcW w:w="4981" w:type="dxa"/>
+            <w:vAlign w:val="center"/>
+          </w:tcPr>
+          <w:p>
+            <w:r>
+              <w:t>Table of students with status, verifying hours</w:t>
+            </w:r>
+          </w:p>
+        </w:tc>
+      </w:tr>
+      <w:tr>
+        <w:trPr>
+          <w:trHeight w:val="510"/>
+        </w:trPr>
+        <w:tc>
+          <w:tcPr>
+            <w:tcW w:w="4981" w:type="dxa"/>
+            <w:vAlign w:val="center"/>
+          </w:tcPr>
+          <w:p>
+            <w:r>
+              <w:t>Public verify</w:t>
+            </w:r>
+          </w:p>
+        </w:tc>
+        <w:tc>
+          <w:tcPr>
+            <w:tcW w:w="4981" w:type="dxa"/>
+            <w:vAlign w:val="center"/>
+          </w:tcPr>
+          <w:p>
+            <w:r>
+              <w:t>Mentor entry approval</w:t>
+            </w:r>
+          </w:p>
+        </w:tc>
+      </w:tr>
+      <w:tr>
+        <w:trPr>
+          <w:trHeight w:val="510"/>
+        </w:trPr>
+        <w:tc>
+          <w:tcPr>
+            <w:tcW w:w="4981" w:type="dxa"/>
+            <w:vAlign w:val="center"/>
+          </w:tcPr>
+          <w:p>
+            <w:r>
+              <w:t>Auth</w:t>
+            </w:r>
+          </w:p>
+        </w:tc>
+        <w:tc>
+          <w:tcPr>
+            <w:tcW w:w="4981" w:type="dxa"/>
+            <w:vAlign w:val="center"/>
+          </w:tcPr>
+          <w:p>
+            <w:r>
+              <w:t>Login, logout, signup</w:t>
+            </w:r>
+          </w:p>
+        </w:tc>
+      </w:tr>
+      <w:tr>
+        <w:trPr>
+          <w:trHeight w:val="510"/>
+        </w:trPr>
+        <w:tc>
+          <w:tcPr>
+            <w:tcW w:w="4981" w:type="dxa"/>
+            <w:vAlign w:val="center"/>
+          </w:tcPr>
+          <w:p>
+            <w:r>
+              <w:t>Verify action</w:t>
+            </w:r>
+          </w:p>
+        </w:tc>
+        <w:tc>
+          <w:tcPr>
+            <w:tcW w:w="4981" w:type="dxa"/>
+            <w:vAlign w:val="center"/>
+          </w:tcPr>
+          <w:p>
+            <w:r>
+              <w:t>Checks token, updates entry status</w:t>
+            </w:r>
+          </w:p>
+        </w:tc>
+      </w:tr>
+    </w:tbl>
+    <w:p/>
+    <w:p>
+      <w:pPr>
+        <w:keepNext/>
+      </w:pPr>
+      <w:r>
+        <w:rPr>
+          <w:noProof/>
+        </w:rPr>
+        <w:lastRenderedPageBreak/>
+        <w:drawing>
+          <wp:inline distT="0" distB="0" distL="0" distR="0" wp14:anchorId="2652741A" wp14:editId="4ACFECF3">
+            <wp:extent cx="6332220" cy="4631690"/>
+            <wp:effectExtent l="0" t="0" r="0" b="0"/>
+            <wp:docPr id="364837870" name="Picture 7"/>
+            <wp:cNvGraphicFramePr>
+              <a:graphicFrameLocks xmlns:a="http://schemas.openxmlformats.org/drawingml/2006/main" noChangeAspect="1"/>
+            </wp:cNvGraphicFramePr>
+            <a:graphic xmlns:a="http://schemas.openxmlformats.org/drawingml/2006/main">
+              <a:graphicData uri="http://schemas.openxmlformats.org/drawingml/2006/picture">
+                <pic:pic xmlns:pic="http://schemas.openxmlformats.org/drawingml/2006/picture">
+                  <pic:nvPicPr>
+                    <pic:cNvPr id="0" name="Picture 9"/>
+                    <pic:cNvPicPr>
+                      <a:picLocks noChangeAspect="1" noChangeArrowheads="1"/>
+                    </pic:cNvPicPr>
+                  </pic:nvPicPr>
+                  <pic:blipFill>
+                    <a:blip r:embed="rId8">
+                      <a:extLst>
+                        <a:ext uri="{28A0092B-C50C-407E-A947-70E740481C1C}">
+                          <a14:useLocalDpi xmlns:a14="http://schemas.microsoft.com/office/drawing/2010/main" val="0"/>
+                        </a:ext>
+                      </a:extLst>
+                    </a:blip>
+                    <a:srcRect/>
+                    <a:stretch>
+                      <a:fillRect/>
+                    </a:stretch>
+                  </pic:blipFill>
+                  <pic:spPr bwMode="auto">
+                    <a:xfrm>
+                      <a:off x="0" y="0"/>
+                      <a:ext cx="6332220" cy="4631690"/>
+                    </a:xfrm>
+                    <a:prstGeom prst="rect">
+                      <a:avLst/>
+                    </a:prstGeom>
+                    <a:noFill/>
+                    <a:ln>
+                      <a:noFill/>
+                    </a:ln>
+                  </pic:spPr>
+                </pic:pic>
+              </a:graphicData>
+            </a:graphic>
+          </wp:inline>
+        </w:drawing>
+      </w:r>
+      <w:r>
+        <w:rPr>
+          <w:noProof/>
+        </w:rPr>
+        <w:t xml:space="preserve"> </w:t>
+      </w:r>
+    </w:p>
+    <w:p>
+      <w:pPr>
+        <w:pStyle w:val="Caption"/>
+      </w:pPr>
+      <w:r>
+        <w:t xml:space="preserve">Figure </w:t>
+      </w:r>
+      <w:r>
+        <w:fldChar w:fldCharType="begin"/>
+      </w:r>
+      <w:r>
+        <w:instrText xml:space="preserve"> SEQ Figure \* ARABIC </w:instrText>
+      </w:r>
+      <w:r>
+        <w:fldChar w:fldCharType="separate"/>
+      </w:r>
+      <w:r>
+        <w:rPr>
+          <w:noProof/>
+        </w:rPr>
+        <w:t>1</w:t>
+      </w:r>
+      <w:r>
+        <w:fldChar w:fldCharType="end"/>
+      </w:r>
+      <w:r>
+        <w:t xml:space="preserve"> Architecture Diagram</w:t>
       </w:r>
     </w:p>
     <w:p>
       <w:r>
-        <w:t>________________________________________________________________________________</w:t>
+        <w:rPr>
+          <w:noProof/>
+        </w:rPr>
+        <w:t xml:space="preserve"> </w:t>
       </w:r>
     </w:p>
     <w:p>
+      <w:pPr>
+        <w:rPr>
+          <w:rFonts w:asciiTheme="majorHAnsi" w:eastAsiaTheme="majorEastAsia" w:hAnsiTheme="majorHAnsi" w:cstheme="majorBidi"/>
+          <w:b/>
+          <w:bCs/>
+          <w:color w:val="365F91" w:themeColor="accent1" w:themeShade="BF"/>
+          <w:sz w:val="30"/>
+          <w:szCs w:val="28"/>
+        </w:rPr>
+      </w:pPr>
       <w:r>
-        <w:t>________________________________________________________________________________</w:t>
+        <w:br w:type="page"/>
       </w:r>
     </w:p>
     <w:p>
+      <w:pPr>
+        <w:pStyle w:val="Heading1"/>
+      </w:pPr>
       <w:r>
-        <w:t>________________________________________________________________________________</w:t>
-      </w:r>
-    </w:p>
-    <w:p>
-      <w:pPr>
-        <w:pStyle w:val="Heading1"/>
-      </w:pPr>
-      <w:r>
+        <w:lastRenderedPageBreak/>
         <w:t>4.3 UML Design</w:t>
       </w:r>
     </w:p>
@@ -299,33 +591,238 @@
       </w:r>
     </w:p>
     <w:p>
+      <w:pPr>
+        <w:keepNext/>
+      </w:pPr>
       <w:r>
-        <w:t>________________________________________________________________________________</w:t>
+        <w:rPr>
+          <w:noProof/>
+        </w:rPr>
+        <w:drawing>
+          <wp:inline distT="0" distB="0" distL="0" distR="0" wp14:anchorId="0EB13002" wp14:editId="3E9302F0">
+            <wp:extent cx="5362575" cy="2997497"/>
+            <wp:effectExtent l="0" t="0" r="0" b="0"/>
+            <wp:docPr id="1790377946" name="Picture 4"/>
+            <wp:cNvGraphicFramePr>
+              <a:graphicFrameLocks xmlns:a="http://schemas.openxmlformats.org/drawingml/2006/main" noChangeAspect="1"/>
+            </wp:cNvGraphicFramePr>
+            <a:graphic xmlns:a="http://schemas.openxmlformats.org/drawingml/2006/main">
+              <a:graphicData uri="http://schemas.openxmlformats.org/drawingml/2006/picture">
+                <pic:pic xmlns:pic="http://schemas.openxmlformats.org/drawingml/2006/picture">
+                  <pic:nvPicPr>
+                    <pic:cNvPr id="0" name="Picture 5"/>
+                    <pic:cNvPicPr>
+                      <a:picLocks noChangeAspect="1" noChangeArrowheads="1"/>
+                    </pic:cNvPicPr>
+                  </pic:nvPicPr>
+                  <pic:blipFill>
+                    <a:blip r:embed="rId9">
+                      <a:extLst>
+                        <a:ext uri="{28A0092B-C50C-407E-A947-70E740481C1C}">
+                          <a14:useLocalDpi xmlns:a14="http://schemas.microsoft.com/office/drawing/2010/main" val="0"/>
+                        </a:ext>
+                      </a:extLst>
+                    </a:blip>
+                    <a:srcRect/>
+                    <a:stretch>
+                      <a:fillRect/>
+                    </a:stretch>
+                  </pic:blipFill>
+                  <pic:spPr bwMode="auto">
+                    <a:xfrm>
+                      <a:off x="0" y="0"/>
+                      <a:ext cx="5363810" cy="2998187"/>
+                    </a:xfrm>
+                    <a:prstGeom prst="rect">
+                      <a:avLst/>
+                    </a:prstGeom>
+                    <a:noFill/>
+                    <a:ln>
+                      <a:noFill/>
+                    </a:ln>
+                  </pic:spPr>
+                </pic:pic>
+              </a:graphicData>
+            </a:graphic>
+          </wp:inline>
+        </w:drawing>
+      </w:r>
+    </w:p>
+    <w:p>
+      <w:pPr>
+        <w:pStyle w:val="Caption"/>
+      </w:pPr>
+      <w:r>
+        <w:t xml:space="preserve">Figure </w:t>
+      </w:r>
+      <w:r>
+        <w:fldChar w:fldCharType="begin"/>
+      </w:r>
+      <w:r>
+        <w:instrText xml:space="preserve"> SEQ Figure \* ARABIC </w:instrText>
+      </w:r>
+      <w:r>
+        <w:fldChar w:fldCharType="separate"/>
+      </w:r>
+      <w:r>
+        <w:rPr>
+          <w:noProof/>
+        </w:rPr>
+        <w:t>2</w:t>
+      </w:r>
+      <w:r>
+        <w:fldChar w:fldCharType="end"/>
+      </w:r>
+      <w:r>
+        <w:t xml:space="preserve"> Sequence Diagram</w:t>
+      </w:r>
+    </w:p>
+    <w:p>
+      <w:pPr>
+        <w:keepNext/>
+      </w:pPr>
+      <w:r>
+        <w:rPr>
+          <w:noProof/>
+        </w:rPr>
+        <w:drawing>
+          <wp:inline distT="0" distB="0" distL="0" distR="0" wp14:anchorId="372032F2" wp14:editId="7B5AAEB6">
+            <wp:extent cx="5414109" cy="3381375"/>
+            <wp:effectExtent l="0" t="0" r="0" b="0"/>
+            <wp:docPr id="1605113780" name="Picture 6"/>
+            <wp:cNvGraphicFramePr>
+              <a:graphicFrameLocks xmlns:a="http://schemas.openxmlformats.org/drawingml/2006/main" noChangeAspect="1"/>
+            </wp:cNvGraphicFramePr>
+            <a:graphic xmlns:a="http://schemas.openxmlformats.org/drawingml/2006/main">
+              <a:graphicData uri="http://schemas.openxmlformats.org/drawingml/2006/picture">
+                <pic:pic xmlns:pic="http://schemas.openxmlformats.org/drawingml/2006/picture">
+                  <pic:nvPicPr>
+                    <pic:cNvPr id="0" name="Picture 7"/>
+                    <pic:cNvPicPr>
+                      <a:picLocks noChangeAspect="1" noChangeArrowheads="1"/>
+                    </pic:cNvPicPr>
+                  </pic:nvPicPr>
+                  <pic:blipFill>
+                    <a:blip r:embed="rId10">
+                      <a:extLst>
+                        <a:ext uri="{28A0092B-C50C-407E-A947-70E740481C1C}">
+                          <a14:useLocalDpi xmlns:a14="http://schemas.microsoft.com/office/drawing/2010/main" val="0"/>
+                        </a:ext>
+                      </a:extLst>
+                    </a:blip>
+                    <a:srcRect/>
+                    <a:stretch>
+                      <a:fillRect/>
+                    </a:stretch>
+                  </pic:blipFill>
+                  <pic:spPr bwMode="auto">
+                    <a:xfrm>
+                      <a:off x="0" y="0"/>
+                      <a:ext cx="5419433" cy="3384700"/>
+                    </a:xfrm>
+                    <a:prstGeom prst="rect">
+                      <a:avLst/>
+                    </a:prstGeom>
+                    <a:noFill/>
+                    <a:ln>
+                      <a:noFill/>
+                    </a:ln>
+                  </pic:spPr>
+                </pic:pic>
+              </a:graphicData>
+            </a:graphic>
+          </wp:inline>
+        </w:drawing>
+      </w:r>
+      <w:r>
+        <w:rPr>
+          <w:noProof/>
+        </w:rPr>
+        <w:t xml:space="preserve"> </w:t>
+      </w:r>
+    </w:p>
+    <w:p>
+      <w:pPr>
+        <w:pStyle w:val="Caption"/>
+      </w:pPr>
+      <w:r>
+        <w:t xml:space="preserve">Figure </w:t>
+      </w:r>
+      <w:r>
+        <w:fldChar w:fldCharType="begin"/>
+      </w:r>
+      <w:r>
+        <w:instrText xml:space="preserve"> SEQ Figure \* ARABIC </w:instrText>
+      </w:r>
+      <w:r>
+        <w:fldChar w:fldCharType="separate"/>
+      </w:r>
+      <w:r>
+        <w:rPr>
+          <w:noProof/>
+        </w:rPr>
+        <w:t>3</w:t>
+      </w:r>
+      <w:r>
+        <w:fldChar w:fldCharType="end"/>
+      </w:r>
+      <w:r>
+        <w:t xml:space="preserve"> Use Case Diagram</w:t>
       </w:r>
     </w:p>
     <w:p>
       <w:r>
-        <w:t>________________________________________________________________________________</w:t>
+        <w:br w:type="page"/>
       </w:r>
     </w:p>
     <w:p>
       <w:r>
-        <w:t>________________________________________________________________________________</w:t>
+        <w:lastRenderedPageBreak/>
+        <w:t xml:space="preserve">The sequence diagram </w:t>
+      </w:r>
+      <w:r>
+        <w:t>shows mentor verification as message between the student, the mentor, TrackWIL, and the database.</w:t>
       </w:r>
     </w:p>
     <w:p>
       <w:r>
-        <w:t>________________________________________________________________________________</w:t>
+        <w:t>The use-case diagram has 3 actors:</w:t>
       </w:r>
     </w:p>
     <w:p>
+      <w:pPr>
+        <w:pStyle w:val="ListParagraph"/>
+        <w:numPr>
+          <w:ilvl w:val="0"/>
+          <w:numId w:val="10"/>
+        </w:numPr>
+      </w:pPr>
       <w:r>
-        <w:t>________________________________________________________________________________</w:t>
+        <w:t>Student – signs up, logs hours, uploads evidence, and shares the entry for checking.</w:t>
       </w:r>
     </w:p>
     <w:p>
+      <w:pPr>
+        <w:pStyle w:val="ListParagraph"/>
+        <w:numPr>
+          <w:ilvl w:val="0"/>
+          <w:numId w:val="10"/>
+        </w:numPr>
+      </w:pPr>
       <w:r>
-        <w:t>________________________________________________________________________________</w:t>
+        <w:t>Mentor – Approves/rejects a student’s entry.</w:t>
+      </w:r>
+    </w:p>
+    <w:p>
+      <w:pPr>
+        <w:pStyle w:val="ListParagraph"/>
+        <w:numPr>
+          <w:ilvl w:val="0"/>
+          <w:numId w:val="10"/>
+        </w:numPr>
+      </w:pPr>
+      <w:r>
+        <w:t>Coordinator – Monitors progress across students.</w:t>
       </w:r>
     </w:p>
     <w:p>
@@ -342,41 +839,113 @@
       </w:r>
     </w:p>
     <w:p>
+      <w:pPr>
+        <w:keepNext/>
+      </w:pPr>
       <w:r>
-        <w:t>________________________________________________________________________________</w:t>
+        <w:rPr>
+          <w:noProof/>
+        </w:rPr>
+        <w:drawing>
+          <wp:inline distT="0" distB="0" distL="0" distR="0" wp14:anchorId="464521BD" wp14:editId="2980BD72">
+            <wp:extent cx="6332220" cy="3714750"/>
+            <wp:effectExtent l="0" t="0" r="0" b="0"/>
+            <wp:docPr id="353826460" name="Picture 8"/>
+            <wp:cNvGraphicFramePr>
+              <a:graphicFrameLocks xmlns:a="http://schemas.openxmlformats.org/drawingml/2006/main" noChangeAspect="1"/>
+            </wp:cNvGraphicFramePr>
+            <a:graphic xmlns:a="http://schemas.openxmlformats.org/drawingml/2006/main">
+              <a:graphicData uri="http://schemas.openxmlformats.org/drawingml/2006/picture">
+                <pic:pic xmlns:pic="http://schemas.openxmlformats.org/drawingml/2006/picture">
+                  <pic:nvPicPr>
+                    <pic:cNvPr id="0" name="Picture 11"/>
+                    <pic:cNvPicPr>
+                      <a:picLocks noChangeAspect="1" noChangeArrowheads="1"/>
+                    </pic:cNvPicPr>
+                  </pic:nvPicPr>
+                  <pic:blipFill>
+                    <a:blip r:embed="rId11">
+                      <a:extLst>
+                        <a:ext uri="{28A0092B-C50C-407E-A947-70E740481C1C}">
+                          <a14:useLocalDpi xmlns:a14="http://schemas.microsoft.com/office/drawing/2010/main" val="0"/>
+                        </a:ext>
+                      </a:extLst>
+                    </a:blip>
+                    <a:srcRect/>
+                    <a:stretch>
+                      <a:fillRect/>
+                    </a:stretch>
+                  </pic:blipFill>
+                  <pic:spPr bwMode="auto">
+                    <a:xfrm>
+                      <a:off x="0" y="0"/>
+                      <a:ext cx="6332220" cy="3714750"/>
+                    </a:xfrm>
+                    <a:prstGeom prst="rect">
+                      <a:avLst/>
+                    </a:prstGeom>
+                    <a:noFill/>
+                    <a:ln>
+                      <a:noFill/>
+                    </a:ln>
+                  </pic:spPr>
+                </pic:pic>
+              </a:graphicData>
+            </a:graphic>
+          </wp:inline>
+        </w:drawing>
       </w:r>
     </w:p>
     <w:p>
+      <w:pPr>
+        <w:pStyle w:val="Caption"/>
+      </w:pPr>
       <w:r>
-        <w:t>________________________________________________________________________________</w:t>
+        <w:t xml:space="preserve">Figure </w:t>
+      </w:r>
+      <w:r>
+        <w:fldChar w:fldCharType="begin"/>
+      </w:r>
+      <w:r>
+        <w:instrText xml:space="preserve"> SEQ Figure \* ARABIC </w:instrText>
+      </w:r>
+      <w:r>
+        <w:fldChar w:fldCharType="separate"/>
+      </w:r>
+      <w:r>
+        <w:rPr>
+          <w:noProof/>
+        </w:rPr>
+        <w:t>4</w:t>
+      </w:r>
+      <w:r>
+        <w:fldChar w:fldCharType="end"/>
+      </w:r>
+      <w:r>
+        <w:t xml:space="preserve"> ERD</w:t>
       </w:r>
     </w:p>
     <w:p>
+      <w:pPr>
+        <w:rPr>
+          <w:rFonts w:asciiTheme="majorHAnsi" w:eastAsiaTheme="majorEastAsia" w:hAnsiTheme="majorHAnsi" w:cstheme="majorBidi"/>
+          <w:b/>
+          <w:bCs/>
+          <w:color w:val="365F91" w:themeColor="accent1" w:themeShade="BF"/>
+          <w:sz w:val="30"/>
+          <w:szCs w:val="28"/>
+        </w:rPr>
+      </w:pPr>
       <w:r>
-        <w:lastRenderedPageBreak/>
-        <w:t>________________________________________________________________________________</w:t>
+        <w:br w:type="page"/>
       </w:r>
     </w:p>
     <w:p>
+      <w:pPr>
+        <w:pStyle w:val="Heading1"/>
+      </w:pPr>
       <w:r>
-        <w:t>________________________________________________________________________________</w:t>
-      </w:r>
-    </w:p>
-    <w:p>
-      <w:r>
-        <w:t>________________________________________________________________________________</w:t>
-      </w:r>
-    </w:p>
-    <w:p>
-      <w:r>
-        <w:t>________________________________________________________________________________</w:t>
-      </w:r>
-    </w:p>
-    <w:p>
-      <w:pPr>
-        <w:pStyle w:val="Heading1"/>
-      </w:pPr>
-      <w:r>
+        <w:lastRenderedPageBreak/>
         <w:t>4.5 User Interface Design</w:t>
       </w:r>
     </w:p>
@@ -424,30 +993,114 @@
       </w:r>
     </w:p>
     <w:p>
+      <w:pPr>
+        <w:pStyle w:val="ListParagraph"/>
+        <w:numPr>
+          <w:ilvl w:val="0"/>
+          <w:numId w:val="11"/>
+        </w:numPr>
+      </w:pPr>
       <w:r>
-        <w:t>________________________________________________________________________________</w:t>
+        <w:t xml:space="preserve">Languages: </w:t>
+      </w:r>
+      <w:r>
+        <w:t>TypeScript, HTML and CSS through JSX, SQL in the schema script</w:t>
+      </w:r>
+    </w:p>
+    <w:p>
+      <w:pPr>
+        <w:pStyle w:val="ListParagraph"/>
+        <w:numPr>
+          <w:ilvl w:val="0"/>
+          <w:numId w:val="11"/>
+        </w:numPr>
+      </w:pPr>
+      <w:r>
+        <w:t>Framework: Next.js 16</w:t>
+      </w:r>
+    </w:p>
+    <w:p>
+      <w:pPr>
+        <w:pStyle w:val="ListParagraph"/>
+        <w:numPr>
+          <w:ilvl w:val="0"/>
+          <w:numId w:val="11"/>
+        </w:numPr>
+      </w:pPr>
+      <w:r>
+        <w:t>IDE: Visual Studio Code</w:t>
+      </w:r>
+    </w:p>
+    <w:p>
+      <w:pPr>
+        <w:pStyle w:val="ListParagraph"/>
+        <w:numPr>
+          <w:ilvl w:val="0"/>
+          <w:numId w:val="11"/>
+        </w:numPr>
+      </w:pPr>
+      <w:r>
+        <w:t>Database: JSON file system</w:t>
+      </w:r>
+    </w:p>
+    <w:p>
+      <w:pPr>
+        <w:pStyle w:val="ListParagraph"/>
+        <w:numPr>
+          <w:ilvl w:val="0"/>
+          <w:numId w:val="11"/>
+        </w:numPr>
+      </w:pPr>
+      <w:r>
+        <w:t>Libraries: Tailwind CSS</w:t>
+      </w:r>
+    </w:p>
+    <w:p>
+      <w:pPr>
+        <w:pStyle w:val="ListParagraph"/>
+        <w:numPr>
+          <w:ilvl w:val="0"/>
+          <w:numId w:val="11"/>
+        </w:numPr>
+      </w:pPr>
+      <w:r>
+        <w:t>Cloud services: none. Local only</w:t>
+      </w:r>
+    </w:p>
+    <w:p>
+      <w:pPr>
+        <w:pStyle w:val="ListParagraph"/>
+        <w:numPr>
+          <w:ilvl w:val="0"/>
+          <w:numId w:val="11"/>
+        </w:numPr>
+      </w:pPr>
+      <w:r>
+        <w:t>Version control: Git and GitHub (</w:t>
+      </w:r>
+      <w:hyperlink r:id="rId12" w:history="1">
+        <w:r>
+          <w:rPr>
+            <w:rStyle w:val="Hyperlink"/>
+          </w:rPr>
+          <w:t>https://github.com/Noobey32/TrackWIL</w:t>
+        </w:r>
+      </w:hyperlink>
+      <w:r>
+        <w:t>)</w:t>
       </w:r>
     </w:p>
     <w:p>
       <w:r>
-        <w:t>________________________________________________________________________________</w:t>
+        <w:br w:type="page"/>
       </w:r>
     </w:p>
     <w:p>
+      <w:pPr>
+        <w:pStyle w:val="Heading1"/>
+      </w:pPr>
       <w:r>
-        <w:t>________________________________________________________________________________</w:t>
-      </w:r>
-    </w:p>
-    <w:p>
-      <w:r>
-        <w:t>________________________________________________________________________________</w:t>
-      </w:r>
-    </w:p>
-    <w:p>
-      <w:pPr>
-        <w:pStyle w:val="Heading1"/>
-      </w:pPr>
-      <w:r>
+        <w:lastRenderedPageBreak/>
         <w:t>4.7 Implementation</w:t>
       </w:r>
     </w:p>
@@ -457,46 +1110,147 @@
       </w:r>
     </w:p>
     <w:p>
+      <w:pPr>
+        <w:pStyle w:val="Heading2"/>
+      </w:pPr>
       <w:r>
-        <w:t>________________________________________________________________________________</w:t>
+        <w:t>Session and role routing</w:t>
       </w:r>
     </w:p>
     <w:p>
       <w:r>
-        <w:t>________________________________________________________________________________</w:t>
+        <w:t>The cookie stores the user id. On request it loads the full user, including the role from storage. After login, a coordinator and student view different dashboards.</w:t>
       </w:r>
     </w:p>
     <w:p>
       <w:r>
-        <w:t>________________________________________________________________________________</w:t>
+        <w:rPr>
+          <w:noProof/>
+        </w:rPr>
+        <w:drawing>
+          <wp:inline distT="0" distB="0" distL="0" distR="0" wp14:anchorId="0B01D745" wp14:editId="7DA50417">
+            <wp:extent cx="5311763" cy="2247900"/>
+            <wp:effectExtent l="0" t="0" r="3810" b="0"/>
+            <wp:docPr id="994686086" name="Picture 9"/>
+            <wp:cNvGraphicFramePr>
+              <a:graphicFrameLocks xmlns:a="http://schemas.openxmlformats.org/drawingml/2006/main" noChangeAspect="1"/>
+            </wp:cNvGraphicFramePr>
+            <a:graphic xmlns:a="http://schemas.openxmlformats.org/drawingml/2006/main">
+              <a:graphicData uri="http://schemas.openxmlformats.org/drawingml/2006/picture">
+                <pic:pic xmlns:pic="http://schemas.openxmlformats.org/drawingml/2006/picture">
+                  <pic:nvPicPr>
+                    <pic:cNvPr id="0" name="Picture 13"/>
+                    <pic:cNvPicPr>
+                      <a:picLocks noChangeAspect="1" noChangeArrowheads="1"/>
+                    </pic:cNvPicPr>
+                  </pic:nvPicPr>
+                  <pic:blipFill>
+                    <a:blip r:embed="rId13">
+                      <a:extLst>
+                        <a:ext uri="{28A0092B-C50C-407E-A947-70E740481C1C}">
+                          <a14:useLocalDpi xmlns:a14="http://schemas.microsoft.com/office/drawing/2010/main" val="0"/>
+                        </a:ext>
+                      </a:extLst>
+                    </a:blip>
+                    <a:srcRect/>
+                    <a:stretch>
+                      <a:fillRect/>
+                    </a:stretch>
+                  </pic:blipFill>
+                  <pic:spPr bwMode="auto">
+                    <a:xfrm>
+                      <a:off x="0" y="0"/>
+                      <a:ext cx="5331753" cy="2256360"/>
+                    </a:xfrm>
+                    <a:prstGeom prst="rect">
+                      <a:avLst/>
+                    </a:prstGeom>
+                    <a:noFill/>
+                    <a:ln>
+                      <a:noFill/>
+                    </a:ln>
+                  </pic:spPr>
+                </pic:pic>
+              </a:graphicData>
+            </a:graphic>
+          </wp:inline>
+        </w:drawing>
+      </w:r>
+    </w:p>
+    <w:p>
+      <w:pPr>
+        <w:pStyle w:val="Heading2"/>
+      </w:pPr>
+      <w:r>
+        <w:t>Mentor verification</w:t>
       </w:r>
     </w:p>
     <w:p>
       <w:r>
-        <w:t>________________________________________________________________________________</w:t>
+        <w:t>Before the status changes, the action checks that the token exists, has not been used, and has not expired. That is what makes the link one-time. After the update, the view is refreshed</w:t>
       </w:r>
     </w:p>
     <w:p>
       <w:r>
-        <w:t>________________________________________________________________________________</w:t>
+        <w:rPr>
+          <w:noProof/>
+        </w:rPr>
+        <w:drawing>
+          <wp:inline distT="0" distB="0" distL="0" distR="0" wp14:anchorId="3E04A873" wp14:editId="0B16F871">
+            <wp:extent cx="5332855" cy="3124200"/>
+            <wp:effectExtent l="0" t="0" r="1270" b="0"/>
+            <wp:docPr id="2064471869" name="Picture 10"/>
+            <wp:cNvGraphicFramePr>
+              <a:graphicFrameLocks xmlns:a="http://schemas.openxmlformats.org/drawingml/2006/main" noChangeAspect="1"/>
+            </wp:cNvGraphicFramePr>
+            <a:graphic xmlns:a="http://schemas.openxmlformats.org/drawingml/2006/main">
+              <a:graphicData uri="http://schemas.openxmlformats.org/drawingml/2006/picture">
+                <pic:pic xmlns:pic="http://schemas.openxmlformats.org/drawingml/2006/picture">
+                  <pic:nvPicPr>
+                    <pic:cNvPr id="0" name="Picture 14"/>
+                    <pic:cNvPicPr>
+                      <a:picLocks noChangeAspect="1" noChangeArrowheads="1"/>
+                    </pic:cNvPicPr>
+                  </pic:nvPicPr>
+                  <pic:blipFill>
+                    <a:blip r:embed="rId14">
+                      <a:extLst>
+                        <a:ext uri="{28A0092B-C50C-407E-A947-70E740481C1C}">
+                          <a14:useLocalDpi xmlns:a14="http://schemas.microsoft.com/office/drawing/2010/main" val="0"/>
+                        </a:ext>
+                      </a:extLst>
+                    </a:blip>
+                    <a:srcRect/>
+                    <a:stretch>
+                      <a:fillRect/>
+                    </a:stretch>
+                  </pic:blipFill>
+                  <pic:spPr bwMode="auto">
+                    <a:xfrm>
+                      <a:off x="0" y="0"/>
+                      <a:ext cx="5369410" cy="3145615"/>
+                    </a:xfrm>
+                    <a:prstGeom prst="rect">
+                      <a:avLst/>
+                    </a:prstGeom>
+                    <a:noFill/>
+                    <a:ln>
+                      <a:noFill/>
+                    </a:ln>
+                  </pic:spPr>
+                </pic:pic>
+              </a:graphicData>
+            </a:graphic>
+          </wp:inline>
+        </w:drawing>
       </w:r>
     </w:p>
     <w:p>
+      <w:pPr>
+        <w:pStyle w:val="Heading1"/>
+      </w:pPr>
       <w:r>
         <w:lastRenderedPageBreak/>
-        <w:t>________________________________________________________________________________</w:t>
-      </w:r>
-    </w:p>
-    <w:p>
-      <w:r>
-        <w:t>________________________________________________________________________________</w:t>
-      </w:r>
-    </w:p>
-    <w:p>
-      <w:pPr>
-        <w:pStyle w:val="Heading1"/>
-      </w:pPr>
-      <w:r>
         <w:t>4.8 Version Control</w:t>
       </w:r>
     </w:p>
@@ -507,29 +1261,170 @@
     </w:p>
     <w:p>
       <w:r>
-        <w:t>________________________________________________________________________________</w:t>
+        <w:t xml:space="preserve">The capstone pack is split into numbered folders (00_ to 12_). The app is in </w:t>
+      </w:r>
+      <w:r>
+        <w:t>`</w:t>
+      </w:r>
+      <w:r>
+        <w:t>5_Source_Code/trackwil/</w:t>
+      </w:r>
+      <w:r>
+        <w:t>`</w:t>
+      </w:r>
+      <w:r>
+        <w:t xml:space="preserve">. This chapter’s diagrams, SQL, and draft live in </w:t>
+      </w:r>
+      <w:r>
+        <w:t>`</w:t>
+      </w:r>
+      <w:r>
+        <w:t>04_System_Design_and_Development/</w:t>
+      </w:r>
+      <w:r>
+        <w:t>`</w:t>
+      </w:r>
+      <w:r>
+        <w:t xml:space="preserve">. Requirements are in </w:t>
+      </w:r>
+      <w:r>
+        <w:t>`</w:t>
+      </w:r>
+      <w:r>
+        <w:t>03_. Project management</w:t>
+      </w:r>
+      <w:r>
+        <w:t>`</w:t>
+      </w:r>
+      <w:r>
+        <w:t>.</w:t>
+      </w:r>
+    </w:p>
+    <w:p>
+      <w:pPr>
+        <w:pStyle w:val="Heading2"/>
+      </w:pPr>
+      <w:r>
+        <w:t>Branches</w:t>
+      </w:r>
+    </w:p>
+    <w:p>
+      <w:pPr>
+        <w:pStyle w:val="ListParagraph"/>
+        <w:numPr>
+          <w:ilvl w:val="0"/>
+          <w:numId w:val="12"/>
+        </w:numPr>
+      </w:pPr>
+      <w:r>
+        <w:t>Main: stable branch on GitHub</w:t>
+      </w:r>
+    </w:p>
+    <w:p>
+      <w:pPr>
+        <w:pStyle w:val="ListParagraph"/>
+        <w:numPr>
+          <w:ilvl w:val="0"/>
+          <w:numId w:val="12"/>
+        </w:numPr>
+      </w:pPr>
+      <w:r>
+        <w:t>app-dev: application development work</w:t>
+      </w:r>
+    </w:p>
+    <w:p>
+      <w:pPr>
+        <w:pStyle w:val="ListParagraph"/>
+        <w:numPr>
+          <w:ilvl w:val="0"/>
+          <w:numId w:val="12"/>
+        </w:numPr>
+      </w:pPr>
+      <w:r>
+        <w:t>moe/system-design: this chapter and its design files.</w:t>
       </w:r>
     </w:p>
     <w:p>
       <w:r>
-        <w:t>________________________________________________________________________________</w:t>
+        <w:t>Branch strategy is for each member to name their branch with their name and the task (name/task), example: moe/system-design.</w:t>
+      </w:r>
+      <w:r>
+        <w:t xml:space="preserve"> Once they are satisfied with their work, it’s merged into main and pushed so everyone can view and work off their changes.</w:t>
+      </w:r>
+    </w:p>
+    <w:p>
+      <w:pPr>
+        <w:pStyle w:val="Heading2"/>
+      </w:pPr>
+      <w:r>
+        <w:t>Team</w:t>
       </w:r>
     </w:p>
     <w:p>
       <w:r>
-        <w:t>________________________________________________________________________________</w:t>
+        <w:t>In addition to the repository owner (Noobey32), here is the team:</w:t>
       </w:r>
     </w:p>
     <w:p>
       <w:r>
-        <w:t>________________________________________________________________________________</w:t>
+        <w:drawing>
+          <wp:inline distT="0" distB="0" distL="0" distR="0" wp14:anchorId="70BFF612" wp14:editId="2C8871C0">
+            <wp:extent cx="6332220" cy="1897380"/>
+            <wp:effectExtent l="0" t="0" r="0" b="7620"/>
+            <wp:docPr id="2006561188" name="Picture 1"/>
+            <wp:cNvGraphicFramePr>
+              <a:graphicFrameLocks xmlns:a="http://schemas.openxmlformats.org/drawingml/2006/main" noChangeAspect="1"/>
+            </wp:cNvGraphicFramePr>
+            <a:graphic xmlns:a="http://schemas.openxmlformats.org/drawingml/2006/main">
+              <a:graphicData uri="http://schemas.openxmlformats.org/drawingml/2006/picture">
+                <pic:pic xmlns:pic="http://schemas.openxmlformats.org/drawingml/2006/picture">
+                  <pic:nvPicPr>
+                    <pic:cNvPr id="2006561188" name=""/>
+                    <pic:cNvPicPr/>
+                  </pic:nvPicPr>
+                  <pic:blipFill>
+                    <a:blip r:embed="rId15"/>
+                    <a:stretch>
+                      <a:fillRect/>
+                    </a:stretch>
+                  </pic:blipFill>
+                  <pic:spPr>
+                    <a:xfrm>
+                      <a:off x="0" y="0"/>
+                      <a:ext cx="6332220" cy="1897380"/>
+                    </a:xfrm>
+                    <a:prstGeom prst="rect">
+                      <a:avLst/>
+                    </a:prstGeom>
+                  </pic:spPr>
+                </pic:pic>
+              </a:graphicData>
+            </a:graphic>
+          </wp:inline>
+        </w:drawing>
       </w:r>
     </w:p>
     <w:p>
       <w:pPr>
+        <w:rPr>
+          <w:rFonts w:asciiTheme="majorHAnsi" w:eastAsiaTheme="majorEastAsia" w:hAnsiTheme="majorHAnsi" w:cstheme="majorBidi"/>
+          <w:b/>
+          <w:bCs/>
+          <w:color w:val="365F91" w:themeColor="accent1" w:themeShade="BF"/>
+          <w:sz w:val="30"/>
+          <w:szCs w:val="28"/>
+        </w:rPr>
+      </w:pPr>
+      <w:r>
+        <w:br w:type="page"/>
+      </w:r>
+    </w:p>
+    <w:p>
+      <w:pPr>
         <w:pStyle w:val="Heading1"/>
       </w:pPr>
       <w:r>
+        <w:lastRenderedPageBreak/>
         <w:t>4.9 Chapter Summary</w:t>
       </w:r>
     </w:p>
@@ -540,22 +1435,98 @@
     </w:p>
     <w:p>
       <w:r>
-        <w:t>________________________________________________________________________________</w:t>
+        <w:t xml:space="preserve">Core features </w:t>
+      </w:r>
+      <w:r>
+        <w:t>implemented</w:t>
+      </w:r>
+      <w:r>
+        <w:t>:</w:t>
+      </w:r>
+    </w:p>
+    <w:p>
+      <w:pPr>
+        <w:pStyle w:val="ListParagraph"/>
+        <w:numPr>
+          <w:ilvl w:val="0"/>
+          <w:numId w:val="13"/>
+        </w:numPr>
+      </w:pPr>
+      <w:r>
+        <w:t>Student logbook entry with optional evidence upload</w:t>
+      </w:r>
+    </w:p>
+    <w:p>
+      <w:pPr>
+        <w:pStyle w:val="ListParagraph"/>
+        <w:numPr>
+          <w:ilvl w:val="0"/>
+          <w:numId w:val="13"/>
+        </w:numPr>
+      </w:pPr>
+      <w:r>
+        <w:t>Verified hours against the required total on the student dashboard</w:t>
+      </w:r>
+    </w:p>
+    <w:p>
+      <w:pPr>
+        <w:pStyle w:val="ListParagraph"/>
+        <w:numPr>
+          <w:ilvl w:val="0"/>
+          <w:numId w:val="13"/>
+        </w:numPr>
+      </w:pPr>
+      <w:r>
+        <w:t>Submit for verification and a mentor link (7-day token)</w:t>
+      </w:r>
+    </w:p>
+    <w:p>
+      <w:pPr>
+        <w:pStyle w:val="ListParagraph"/>
+        <w:numPr>
+          <w:ilvl w:val="0"/>
+          <w:numId w:val="13"/>
+        </w:numPr>
+      </w:pPr>
+      <w:r>
+        <w:t>Mentors</w:t>
+      </w:r>
+      <w:r>
+        <w:t xml:space="preserve"> approve or reject on a public URL, no login</w:t>
+      </w:r>
+    </w:p>
+    <w:p>
+      <w:pPr>
+        <w:pStyle w:val="ListParagraph"/>
+        <w:numPr>
+          <w:ilvl w:val="0"/>
+          <w:numId w:val="13"/>
+        </w:numPr>
+      </w:pPr>
+      <w:r>
+        <w:t>Coordinator dashboard (status, hours, pending counts)</w:t>
+      </w:r>
+    </w:p>
+    <w:p>
+      <w:pPr>
+        <w:pStyle w:val="ListParagraph"/>
+        <w:numPr>
+          <w:ilvl w:val="0"/>
+          <w:numId w:val="13"/>
+        </w:numPr>
+      </w:pPr>
+      <w:r>
+        <w:t>Student signup with email and password checks</w:t>
       </w:r>
     </w:p>
     <w:p>
       <w:r>
-        <w:t>________________________________________________________________________________</w:t>
-      </w:r>
-    </w:p>
-    <w:p>
-      <w:r>
-        <w:t>________________________________________________________________________________</w:t>
+        <w:t>These features form the basis for the MVP and serve to demonstrate the potential of TrackWIL.</w:t>
       </w:r>
     </w:p>
     <w:sectPr>
-      <w:headerReference w:type="default" r:id="rId8"/>
-      <w:footerReference w:type="default" r:id="rId9"/>
+      <w:headerReference w:type="default" r:id="rId16"/>
+      <w:footerReference w:type="default" r:id="rId17"/>
       <w:pgSz w:w="12240" w:h="15840"/>
       <w:pgMar w:top="964" w:right="1134" w:bottom="964" w:left="1134" w:header="720" w:footer="720" w:gutter="0"/>
       <w:cols w:space="720"/>
@@ -854,6 +1825,458 @@
       </w:rPr>
     </w:lvl>
   </w:abstractNum>
+  <w:abstractNum w:abstractNumId="9" w15:restartNumberingAfterBreak="0">
+    <w:nsid w:val="10123F7D"/>
+    <w:multiLevelType w:val="hybridMultilevel"/>
+    <w:tmpl w:val="CB6449AA"/>
+    <w:lvl w:ilvl="0" w:tplc="1C090001">
+      <w:start w:val="1"/>
+      <w:numFmt w:val="bullet"/>
+      <w:lvlText w:val=""/>
+      <w:lvlJc w:val="left"/>
+      <w:pPr>
+        <w:ind w:left="720" w:hanging="360"/>
+      </w:pPr>
+      <w:rPr>
+        <w:rFonts w:ascii="Symbol" w:hAnsi="Symbol" w:hint="default"/>
+      </w:rPr>
+    </w:lvl>
+    <w:lvl w:ilvl="1" w:tplc="1C090003" w:tentative="1">
+      <w:start w:val="1"/>
+      <w:numFmt w:val="bullet"/>
+      <w:lvlText w:val="o"/>
+      <w:lvlJc w:val="left"/>
+      <w:pPr>
+        <w:ind w:left="1440" w:hanging="360"/>
+      </w:pPr>
+      <w:rPr>
+        <w:rFonts w:ascii="Courier New" w:hAnsi="Courier New" w:cs="Courier New" w:hint="default"/>
+      </w:rPr>
+    </w:lvl>
+    <w:lvl w:ilvl="2" w:tplc="1C090005" w:tentative="1">
+      <w:start w:val="1"/>
+      <w:numFmt w:val="bullet"/>
+      <w:lvlText w:val=""/>
+      <w:lvlJc w:val="left"/>
+      <w:pPr>
+        <w:ind w:left="2160" w:hanging="360"/>
+      </w:pPr>
+      <w:rPr>
+        <w:rFonts w:ascii="Wingdings" w:hAnsi="Wingdings" w:hint="default"/>
+      </w:rPr>
+    </w:lvl>
+    <w:lvl w:ilvl="3" w:tplc="1C090001" w:tentative="1">
+      <w:start w:val="1"/>
+      <w:numFmt w:val="bullet"/>
+      <w:lvlText w:val=""/>
+      <w:lvlJc w:val="left"/>
+      <w:pPr>
+        <w:ind w:left="2880" w:hanging="360"/>
+      </w:pPr>
+      <w:rPr>
+        <w:rFonts w:ascii="Symbol" w:hAnsi="Symbol" w:hint="default"/>
+      </w:rPr>
+    </w:lvl>
+    <w:lvl w:ilvl="4" w:tplc="1C090003" w:tentative="1">
+      <w:start w:val="1"/>
+      <w:numFmt w:val="bullet"/>
+      <w:lvlText w:val="o"/>
+      <w:lvlJc w:val="left"/>
+      <w:pPr>
+        <w:ind w:left="3600" w:hanging="360"/>
+      </w:pPr>
+      <w:rPr>
+        <w:rFonts w:ascii="Courier New" w:hAnsi="Courier New" w:cs="Courier New" w:hint="default"/>
+      </w:rPr>
+    </w:lvl>
+    <w:lvl w:ilvl="5" w:tplc="1C090005" w:tentative="1">
+      <w:start w:val="1"/>
+      <w:numFmt w:val="bullet"/>
+      <w:lvlText w:val=""/>
+      <w:lvlJc w:val="left"/>
+      <w:pPr>
+        <w:ind w:left="4320" w:hanging="360"/>
+      </w:pPr>
+      <w:rPr>
+        <w:rFonts w:ascii="Wingdings" w:hAnsi="Wingdings" w:hint="default"/>
+      </w:rPr>
+    </w:lvl>
+    <w:lvl w:ilvl="6" w:tplc="1C090001" w:tentative="1">
+      <w:start w:val="1"/>
+      <w:numFmt w:val="bullet"/>
+      <w:lvlText w:val=""/>
+      <w:lvlJc w:val="left"/>
+      <w:pPr>
+        <w:ind w:left="5040" w:hanging="360"/>
+      </w:pPr>
+      <w:rPr>
+        <w:rFonts w:ascii="Symbol" w:hAnsi="Symbol" w:hint="default"/>
+      </w:rPr>
+    </w:lvl>
+    <w:lvl w:ilvl="7" w:tplc="1C090003" w:tentative="1">
+      <w:start w:val="1"/>
+      <w:numFmt w:val="bullet"/>
+      <w:lvlText w:val="o"/>
+      <w:lvlJc w:val="left"/>
+      <w:pPr>
+        <w:ind w:left="5760" w:hanging="360"/>
+      </w:pPr>
+      <w:rPr>
+        <w:rFonts w:ascii="Courier New" w:hAnsi="Courier New" w:cs="Courier New" w:hint="default"/>
+      </w:rPr>
+    </w:lvl>
+    <w:lvl w:ilvl="8" w:tplc="1C090005" w:tentative="1">
+      <w:start w:val="1"/>
+      <w:numFmt w:val="bullet"/>
+      <w:lvlText w:val=""/>
+      <w:lvlJc w:val="left"/>
+      <w:pPr>
+        <w:ind w:left="6480" w:hanging="360"/>
+      </w:pPr>
+      <w:rPr>
+        <w:rFonts w:ascii="Wingdings" w:hAnsi="Wingdings" w:hint="default"/>
+      </w:rPr>
+    </w:lvl>
+  </w:abstractNum>
+  <w:abstractNum w:abstractNumId="10" w15:restartNumberingAfterBreak="0">
+    <w:nsid w:val="314B58DE"/>
+    <w:multiLevelType w:val="hybridMultilevel"/>
+    <w:tmpl w:val="F0547E08"/>
+    <w:lvl w:ilvl="0" w:tplc="1C090001">
+      <w:start w:val="1"/>
+      <w:numFmt w:val="bullet"/>
+      <w:lvlText w:val=""/>
+      <w:lvlJc w:val="left"/>
+      <w:pPr>
+        <w:ind w:left="720" w:hanging="360"/>
+      </w:pPr>
+      <w:rPr>
+        <w:rFonts w:ascii="Symbol" w:hAnsi="Symbol" w:hint="default"/>
+      </w:rPr>
+    </w:lvl>
+    <w:lvl w:ilvl="1" w:tplc="1C090003" w:tentative="1">
+      <w:start w:val="1"/>
+      <w:numFmt w:val="bullet"/>
+      <w:lvlText w:val="o"/>
+      <w:lvlJc w:val="left"/>
+      <w:pPr>
+        <w:ind w:left="1440" w:hanging="360"/>
+      </w:pPr>
+      <w:rPr>
+        <w:rFonts w:ascii="Courier New" w:hAnsi="Courier New" w:cs="Courier New" w:hint="default"/>
+      </w:rPr>
+    </w:lvl>
+    <w:lvl w:ilvl="2" w:tplc="1C090005" w:tentative="1">
+      <w:start w:val="1"/>
+      <w:numFmt w:val="bullet"/>
+      <w:lvlText w:val=""/>
+      <w:lvlJc w:val="left"/>
+      <w:pPr>
+        <w:ind w:left="2160" w:hanging="360"/>
+      </w:pPr>
+      <w:rPr>
+        <w:rFonts w:ascii="Wingdings" w:hAnsi="Wingdings" w:hint="default"/>
+      </w:rPr>
+    </w:lvl>
+    <w:lvl w:ilvl="3" w:tplc="1C090001" w:tentative="1">
+      <w:start w:val="1"/>
+      <w:numFmt w:val="bullet"/>
+      <w:lvlText w:val=""/>
+      <w:lvlJc w:val="left"/>
+      <w:pPr>
+        <w:ind w:left="2880" w:hanging="360"/>
+      </w:pPr>
+      <w:rPr>
+        <w:rFonts w:ascii="Symbol" w:hAnsi="Symbol" w:hint="default"/>
+      </w:rPr>
+    </w:lvl>
+    <w:lvl w:ilvl="4" w:tplc="1C090003" w:tentative="1">
+      <w:start w:val="1"/>
+      <w:numFmt w:val="bullet"/>
+      <w:lvlText w:val="o"/>
+      <w:lvlJc w:val="left"/>
+      <w:pPr>
+        <w:ind w:left="3600" w:hanging="360"/>
+      </w:pPr>
+      <w:rPr>
+        <w:rFonts w:ascii="Courier New" w:hAnsi="Courier New" w:cs="Courier New" w:hint="default"/>
+      </w:rPr>
+    </w:lvl>
+    <w:lvl w:ilvl="5" w:tplc="1C090005" w:tentative="1">
+      <w:start w:val="1"/>
+      <w:numFmt w:val="bullet"/>
+      <w:lvlText w:val=""/>
+      <w:lvlJc w:val="left"/>
+      <w:pPr>
+        <w:ind w:left="4320" w:hanging="360"/>
+      </w:pPr>
+      <w:rPr>
+        <w:rFonts w:ascii="Wingdings" w:hAnsi="Wingdings" w:hint="default"/>
+      </w:rPr>
+    </w:lvl>
+    <w:lvl w:ilvl="6" w:tplc="1C090001" w:tentative="1">
+      <w:start w:val="1"/>
+      <w:numFmt w:val="bullet"/>
+      <w:lvlText w:val=""/>
+      <w:lvlJc w:val="left"/>
+      <w:pPr>
+        <w:ind w:left="5040" w:hanging="360"/>
+      </w:pPr>
+      <w:rPr>
+        <w:rFonts w:ascii="Symbol" w:hAnsi="Symbol" w:hint="default"/>
+      </w:rPr>
+    </w:lvl>
+    <w:lvl w:ilvl="7" w:tplc="1C090003" w:tentative="1">
+      <w:start w:val="1"/>
+      <w:numFmt w:val="bullet"/>
+      <w:lvlText w:val="o"/>
+      <w:lvlJc w:val="left"/>
+      <w:pPr>
+        <w:ind w:left="5760" w:hanging="360"/>
+      </w:pPr>
+      <w:rPr>
+        <w:rFonts w:ascii="Courier New" w:hAnsi="Courier New" w:cs="Courier New" w:hint="default"/>
+      </w:rPr>
+    </w:lvl>
+    <w:lvl w:ilvl="8" w:tplc="1C090005" w:tentative="1">
+      <w:start w:val="1"/>
+      <w:numFmt w:val="bullet"/>
+      <w:lvlText w:val=""/>
+      <w:lvlJc w:val="left"/>
+      <w:pPr>
+        <w:ind w:left="6480" w:hanging="360"/>
+      </w:pPr>
+      <w:rPr>
+        <w:rFonts w:ascii="Wingdings" w:hAnsi="Wingdings" w:hint="default"/>
+      </w:rPr>
+    </w:lvl>
+  </w:abstractNum>
+  <w:abstractNum w:abstractNumId="11" w15:restartNumberingAfterBreak="0">
+    <w:nsid w:val="6EAC1AC8"/>
+    <w:multiLevelType w:val="hybridMultilevel"/>
+    <w:tmpl w:val="5CAA3F68"/>
+    <w:lvl w:ilvl="0" w:tplc="1C090001">
+      <w:start w:val="1"/>
+      <w:numFmt w:val="bullet"/>
+      <w:lvlText w:val=""/>
+      <w:lvlJc w:val="left"/>
+      <w:pPr>
+        <w:ind w:left="720" w:hanging="360"/>
+      </w:pPr>
+      <w:rPr>
+        <w:rFonts w:ascii="Symbol" w:hAnsi="Symbol" w:hint="default"/>
+      </w:rPr>
+    </w:lvl>
+    <w:lvl w:ilvl="1" w:tplc="1C090003" w:tentative="1">
+      <w:start w:val="1"/>
+      <w:numFmt w:val="bullet"/>
+      <w:lvlText w:val="o"/>
+      <w:lvlJc w:val="left"/>
+      <w:pPr>
+        <w:ind w:left="1440" w:hanging="360"/>
+      </w:pPr>
+      <w:rPr>
+        <w:rFonts w:ascii="Courier New" w:hAnsi="Courier New" w:cs="Courier New" w:hint="default"/>
+      </w:rPr>
+    </w:lvl>
+    <w:lvl w:ilvl="2" w:tplc="1C090005" w:tentative="1">
+      <w:start w:val="1"/>
+      <w:numFmt w:val="bullet"/>
+      <w:lvlText w:val=""/>
+      <w:lvlJc w:val="left"/>
+      <w:pPr>
+        <w:ind w:left="2160" w:hanging="360"/>
+      </w:pPr>
+      <w:rPr>
+        <w:rFonts w:ascii="Wingdings" w:hAnsi="Wingdings" w:hint="default"/>
+      </w:rPr>
+    </w:lvl>
+    <w:lvl w:ilvl="3" w:tplc="1C090001" w:tentative="1">
+      <w:start w:val="1"/>
+      <w:numFmt w:val="bullet"/>
+      <w:lvlText w:val=""/>
+      <w:lvlJc w:val="left"/>
+      <w:pPr>
+        <w:ind w:left="2880" w:hanging="360"/>
+      </w:pPr>
+      <w:rPr>
+        <w:rFonts w:ascii="Symbol" w:hAnsi="Symbol" w:hint="default"/>
+      </w:rPr>
+    </w:lvl>
+    <w:lvl w:ilvl="4" w:tplc="1C090003" w:tentative="1">
+      <w:start w:val="1"/>
+      <w:numFmt w:val="bullet"/>
+      <w:lvlText w:val="o"/>
+      <w:lvlJc w:val="left"/>
+      <w:pPr>
+        <w:ind w:left="3600" w:hanging="360"/>
+      </w:pPr>
+      <w:rPr>
+        <w:rFonts w:ascii="Courier New" w:hAnsi="Courier New" w:cs="Courier New" w:hint="default"/>
+      </w:rPr>
+    </w:lvl>
+    <w:lvl w:ilvl="5" w:tplc="1C090005" w:tentative="1">
+      <w:start w:val="1"/>
+      <w:numFmt w:val="bullet"/>
+      <w:lvlText w:val=""/>
+      <w:lvlJc w:val="left"/>
+      <w:pPr>
+        <w:ind w:left="4320" w:hanging="360"/>
+      </w:pPr>
+      <w:rPr>
+        <w:rFonts w:ascii="Wingdings" w:hAnsi="Wingdings" w:hint="default"/>
+      </w:rPr>
+    </w:lvl>
+    <w:lvl w:ilvl="6" w:tplc="1C090001" w:tentative="1">
+      <w:start w:val="1"/>
+      <w:numFmt w:val="bullet"/>
+      <w:lvlText w:val=""/>
+      <w:lvlJc w:val="left"/>
+      <w:pPr>
+        <w:ind w:left="5040" w:hanging="360"/>
+      </w:pPr>
+      <w:rPr>
+        <w:rFonts w:ascii="Symbol" w:hAnsi="Symbol" w:hint="default"/>
+      </w:rPr>
+    </w:lvl>
+    <w:lvl w:ilvl="7" w:tplc="1C090003" w:tentative="1">
+      <w:start w:val="1"/>
+      <w:numFmt w:val="bullet"/>
+      <w:lvlText w:val="o"/>
+      <w:lvlJc w:val="left"/>
+      <w:pPr>
+        <w:ind w:left="5760" w:hanging="360"/>
+      </w:pPr>
+      <w:rPr>
+        <w:rFonts w:ascii="Courier New" w:hAnsi="Courier New" w:cs="Courier New" w:hint="default"/>
+      </w:rPr>
+    </w:lvl>
+    <w:lvl w:ilvl="8" w:tplc="1C090005" w:tentative="1">
+      <w:start w:val="1"/>
+      <w:numFmt w:val="bullet"/>
+      <w:lvlText w:val=""/>
+      <w:lvlJc w:val="left"/>
+      <w:pPr>
+        <w:ind w:left="6480" w:hanging="360"/>
+      </w:pPr>
+      <w:rPr>
+        <w:rFonts w:ascii="Wingdings" w:hAnsi="Wingdings" w:hint="default"/>
+      </w:rPr>
+    </w:lvl>
+  </w:abstractNum>
+  <w:abstractNum w:abstractNumId="12" w15:restartNumberingAfterBreak="0">
+    <w:nsid w:val="7BA95F47"/>
+    <w:multiLevelType w:val="hybridMultilevel"/>
+    <w:tmpl w:val="E8BC0B8A"/>
+    <w:lvl w:ilvl="0" w:tplc="1C090001">
+      <w:start w:val="1"/>
+      <w:numFmt w:val="bullet"/>
+      <w:lvlText w:val=""/>
+      <w:lvlJc w:val="left"/>
+      <w:pPr>
+        <w:ind w:left="720" w:hanging="360"/>
+      </w:pPr>
+      <w:rPr>
+        <w:rFonts w:ascii="Symbol" w:hAnsi="Symbol" w:hint="default"/>
+      </w:rPr>
+    </w:lvl>
+    <w:lvl w:ilvl="1" w:tplc="1C090003" w:tentative="1">
+      <w:start w:val="1"/>
+      <w:numFmt w:val="bullet"/>
+      <w:lvlText w:val="o"/>
+      <w:lvlJc w:val="left"/>
+      <w:pPr>
+        <w:ind w:left="1440" w:hanging="360"/>
+      </w:pPr>
+      <w:rPr>
+        <w:rFonts w:ascii="Courier New" w:hAnsi="Courier New" w:cs="Courier New" w:hint="default"/>
+      </w:rPr>
+    </w:lvl>
+    <w:lvl w:ilvl="2" w:tplc="1C090005" w:tentative="1">
+      <w:start w:val="1"/>
+      <w:numFmt w:val="bullet"/>
+      <w:lvlText w:val=""/>
+      <w:lvlJc w:val="left"/>
+      <w:pPr>
+        <w:ind w:left="2160" w:hanging="360"/>
+      </w:pPr>
+      <w:rPr>
+        <w:rFonts w:ascii="Wingdings" w:hAnsi="Wingdings" w:hint="default"/>
+      </w:rPr>
+    </w:lvl>
+    <w:lvl w:ilvl="3" w:tplc="1C090001" w:tentative="1">
+      <w:start w:val="1"/>
+      <w:numFmt w:val="bullet"/>
+      <w:lvlText w:val=""/>
+      <w:lvlJc w:val="left"/>
+      <w:pPr>
+        <w:ind w:left="2880" w:hanging="360"/>
+      </w:pPr>
+      <w:rPr>
+        <w:rFonts w:ascii="Symbol" w:hAnsi="Symbol" w:hint="default"/>
+      </w:rPr>
+    </w:lvl>
+    <w:lvl w:ilvl="4" w:tplc="1C090003" w:tentative="1">
+      <w:start w:val="1"/>
+      <w:numFmt w:val="bullet"/>
+      <w:lvlText w:val="o"/>
+      <w:lvlJc w:val="left"/>
+      <w:pPr>
+        <w:ind w:left="3600" w:hanging="360"/>
+      </w:pPr>
+      <w:rPr>
+        <w:rFonts w:ascii="Courier New" w:hAnsi="Courier New" w:cs="Courier New" w:hint="default"/>
+      </w:rPr>
+    </w:lvl>
+    <w:lvl w:ilvl="5" w:tplc="1C090005" w:tentative="1">
+      <w:start w:val="1"/>
+      <w:numFmt w:val="bullet"/>
+      <w:lvlText w:val=""/>
+      <w:lvlJc w:val="left"/>
+      <w:pPr>
+        <w:ind w:left="4320" w:hanging="360"/>
+      </w:pPr>
+      <w:rPr>
+        <w:rFonts w:ascii="Wingdings" w:hAnsi="Wingdings" w:hint="default"/>
+      </w:rPr>
+    </w:lvl>
+    <w:lvl w:ilvl="6" w:tplc="1C090001" w:tentative="1">
+      <w:start w:val="1"/>
+      <w:numFmt w:val="bullet"/>
+      <w:lvlText w:val=""/>
+      <w:lvlJc w:val="left"/>
+      <w:pPr>
+        <w:ind w:left="5040" w:hanging="360"/>
+      </w:pPr>
+      <w:rPr>
+        <w:rFonts w:ascii="Symbol" w:hAnsi="Symbol" w:hint="default"/>
+      </w:rPr>
+    </w:lvl>
+    <w:lvl w:ilvl="7" w:tplc="1C090003" w:tentative="1">
+      <w:start w:val="1"/>
+      <w:numFmt w:val="bullet"/>
+      <w:lvlText w:val="o"/>
+      <w:lvlJc w:val="left"/>
+      <w:pPr>
+        <w:ind w:left="5760" w:hanging="360"/>
+      </w:pPr>
+      <w:rPr>
+        <w:rFonts w:ascii="Courier New" w:hAnsi="Courier New" w:cs="Courier New" w:hint="default"/>
+      </w:rPr>
+    </w:lvl>
+    <w:lvl w:ilvl="8" w:tplc="1C090005" w:tentative="1">
+      <w:start w:val="1"/>
+      <w:numFmt w:val="bullet"/>
+      <w:lvlText w:val=""/>
+      <w:lvlJc w:val="left"/>
+      <w:pPr>
+        <w:ind w:left="6480" w:hanging="360"/>
+      </w:pPr>
+      <w:rPr>
+        <w:rFonts w:ascii="Wingdings" w:hAnsi="Wingdings" w:hint="default"/>
+      </w:rPr>
+    </w:lvl>
+  </w:abstractNum>
   <w:num w:numId="1" w16cid:durableId="826095072">
     <w:abstractNumId w:val="8"/>
   </w:num>
@@ -880,6 +2303,18 @@
   </w:num>
   <w:num w:numId="9" w16cid:durableId="265814379">
     <w:abstractNumId w:val="0"/>
+  </w:num>
+  <w:num w:numId="10" w16cid:durableId="166139304">
+    <w:abstractNumId w:val="12"/>
+  </w:num>
+  <w:num w:numId="11" w16cid:durableId="2090539787">
+    <w:abstractNumId w:val="10"/>
+  </w:num>
+  <w:num w:numId="12" w16cid:durableId="265355977">
+    <w:abstractNumId w:val="9"/>
+  </w:num>
+  <w:num w:numId="13" w16cid:durableId="705636927">
+    <w:abstractNumId w:val="11"/>
   </w:num>
 </w:numbering>
 </file>
@@ -1490,7 +2925,6 @@
   <w:style w:type="character" w:default="1" w:styleId="DefaultParagraphFont">
     <w:name w:val="Default Paragraph Font"/>
     <w:uiPriority w:val="1"/>
-    <w:semiHidden/>
     <w:unhideWhenUsed/>
   </w:style>
   <w:style w:type="table" w:default="1" w:styleId="TableNormal">
@@ -2061,7 +3495,6 @@
     <w:basedOn w:val="Normal"/>
     <w:next w:val="Normal"/>
     <w:uiPriority w:val="35"/>
-    <w:semiHidden/>
     <w:unhideWhenUsed/>
     <w:qFormat/>
     <w:rsid w:val="00FC693F"/>
@@ -12267,6 +13700,29 @@
         <w:shd w:val="clear" w:color="auto" w:fill="FBCAA2" w:themeFill="accent6" w:themeFillTint="7F"/>
       </w:tcPr>
     </w:tblStylePr>
+  </w:style>
+  <w:style w:type="character" w:styleId="Hyperlink">
+    <w:name w:val="Hyperlink"/>
+    <w:basedOn w:val="DefaultParagraphFont"/>
+    <w:uiPriority w:val="99"/>
+    <w:unhideWhenUsed/>
+    <w:rsid w:val="00D34D98"/>
+    <w:rPr>
+      <w:color w:val="0000FF" w:themeColor="hyperlink"/>
+      <w:u w:val="single"/>
+    </w:rPr>
+  </w:style>
+  <w:style w:type="character" w:styleId="UnresolvedMention">
+    <w:name w:val="Unresolved Mention"/>
+    <w:basedOn w:val="DefaultParagraphFont"/>
+    <w:uiPriority w:val="99"/>
+    <w:semiHidden/>
+    <w:unhideWhenUsed/>
+    <w:rsid w:val="00D34D98"/>
+    <w:rPr>
+      <w:color w:val="605E5C"/>
+      <w:shd w:val="clear" w:color="auto" w:fill="E1DFDD"/>
+    </w:rPr>
   </w:style>
 </w:styles>
 </file>

</xml_diff>

<commit_message>
Update sprint backlog, risk register and weekly progress report
- Sprint backlog: 39 tasks from the proposal to the final submission,
  each completed task linked to its commits or pull request; remaining
  tasks for 23-29 October with owners and due dates
- Risk, Issue and Change Register: 8 risks, 6 issues (including the
  session cookie and expired-link defects and the Next.js advisory) and
  6 scope and design changes with status and outcome
- Weekly Progress Report for Week 4 (19-23 October): planned work,
  completed work with evidence, challenges and the final-week plan
- Chapter 4: contribution table uses the members' GitHub usernames
</commit_message>
<xml_diff>
--- a/04_System_Design_and_Development/Chapter_4_System_Design_and_Development.docx
+++ b/04_System_Design_and_Development/Chapter_4_System_Design_and_Development.docx
@@ -255,10 +255,10 @@
         </w:rPr>
         <w:lastRenderedPageBreak/>
         <w:drawing>
-          <wp:inline distT="0" distB="0" distL="0" distR="0" wp14:anchorId="1CA9B0D6" wp14:editId="49CCEE44">
+          <wp:inline distT="0" distB="0" distL="0" distR="0" wp14:anchorId="4084BC24" wp14:editId="0E0102D7">
             <wp:extent cx="6332220" cy="4629150"/>
             <wp:effectExtent l="0" t="0" r="0" b="0"/>
-            <wp:docPr id="960926968" name="Picture 1"/>
+            <wp:docPr id="134618107" name="Picture 1"/>
             <wp:cNvGraphicFramePr>
               <a:graphicFrameLocks xmlns:a="http://schemas.openxmlformats.org/drawingml/2006/main" noChangeAspect="1"/>
             </wp:cNvGraphicFramePr>
@@ -266,7 +266,7 @@
               <a:graphicData uri="http://schemas.openxmlformats.org/drawingml/2006/picture">
                 <pic:pic xmlns:pic="http://schemas.openxmlformats.org/drawingml/2006/picture">
                   <pic:nvPicPr>
-                    <pic:cNvPr id="960926968" name=""/>
+                    <pic:cNvPr id="134618107" name=""/>
                     <pic:cNvPicPr/>
                   </pic:nvPicPr>
                   <pic:blipFill>
@@ -1755,10 +1755,10 @@
           <w:noProof/>
         </w:rPr>
         <w:drawing>
-          <wp:inline distT="0" distB="0" distL="0" distR="0" wp14:anchorId="664786BC" wp14:editId="66A5AF14">
+          <wp:inline distT="0" distB="0" distL="0" distR="0" wp14:anchorId="5F8A47A5" wp14:editId="37E235AD">
             <wp:extent cx="6332220" cy="5362575"/>
             <wp:effectExtent l="0" t="0" r="0" b="9525"/>
-            <wp:docPr id="2005705441" name="Picture 2"/>
+            <wp:docPr id="1794806019" name="Picture 2"/>
             <wp:cNvGraphicFramePr>
               <a:graphicFrameLocks xmlns:a="http://schemas.openxmlformats.org/drawingml/2006/main" noChangeAspect="1"/>
             </wp:cNvGraphicFramePr>
@@ -1766,7 +1766,7 @@
               <a:graphicData uri="http://schemas.openxmlformats.org/drawingml/2006/picture">
                 <pic:pic xmlns:pic="http://schemas.openxmlformats.org/drawingml/2006/picture">
                   <pic:nvPicPr>
-                    <pic:cNvPr id="2005705441" name=""/>
+                    <pic:cNvPr id="1794806019" name=""/>
                     <pic:cNvPicPr/>
                   </pic:nvPicPr>
                   <pic:blipFill>
@@ -1869,10 +1869,10 @@
           <w:noProof/>
         </w:rPr>
         <w:drawing>
-          <wp:inline distT="0" distB="0" distL="0" distR="0" wp14:anchorId="3FFB6C62" wp14:editId="24F37D96">
+          <wp:inline distT="0" distB="0" distL="0" distR="0" wp14:anchorId="2D8FFF02" wp14:editId="1FDBB675">
             <wp:extent cx="6332220" cy="5210810"/>
             <wp:effectExtent l="0" t="0" r="0" b="8890"/>
-            <wp:docPr id="600240936" name="Picture 3"/>
+            <wp:docPr id="592638233" name="Picture 3"/>
             <wp:cNvGraphicFramePr>
               <a:graphicFrameLocks xmlns:a="http://schemas.openxmlformats.org/drawingml/2006/main" noChangeAspect="1"/>
             </wp:cNvGraphicFramePr>
@@ -1880,7 +1880,7 @@
               <a:graphicData uri="http://schemas.openxmlformats.org/drawingml/2006/picture">
                 <pic:pic xmlns:pic="http://schemas.openxmlformats.org/drawingml/2006/picture">
                   <pic:nvPicPr>
-                    <pic:cNvPr id="600240936" name=""/>
+                    <pic:cNvPr id="592638233" name=""/>
                     <pic:cNvPicPr/>
                   </pic:nvPicPr>
                   <pic:blipFill>
@@ -1980,10 +1980,10 @@
           <w:noProof/>
         </w:rPr>
         <w:drawing>
-          <wp:inline distT="0" distB="0" distL="0" distR="0" wp14:anchorId="627CC185" wp14:editId="1181A2EA">
+          <wp:inline distT="0" distB="0" distL="0" distR="0" wp14:anchorId="6B940AEA" wp14:editId="79331D74">
             <wp:extent cx="5161539" cy="5969000"/>
             <wp:effectExtent l="0" t="0" r="1270" b="0"/>
-            <wp:docPr id="1057347689" name="Picture 4"/>
+            <wp:docPr id="1334800263" name="Picture 4"/>
             <wp:cNvGraphicFramePr>
               <a:graphicFrameLocks xmlns:a="http://schemas.openxmlformats.org/drawingml/2006/main" noChangeAspect="1"/>
             </wp:cNvGraphicFramePr>
@@ -1991,7 +1991,7 @@
               <a:graphicData uri="http://schemas.openxmlformats.org/drawingml/2006/picture">
                 <pic:pic xmlns:pic="http://schemas.openxmlformats.org/drawingml/2006/picture">
                   <pic:nvPicPr>
-                    <pic:cNvPr id="1057347689" name=""/>
+                    <pic:cNvPr id="1334800263" name=""/>
                     <pic:cNvPicPr/>
                   </pic:nvPicPr>
                   <pic:blipFill>
@@ -2091,10 +2091,10 @@
           <w:noProof/>
         </w:rPr>
         <w:drawing>
-          <wp:inline distT="0" distB="0" distL="0" distR="0" wp14:anchorId="40084CC8" wp14:editId="1571DE5C">
+          <wp:inline distT="0" distB="0" distL="0" distR="0" wp14:anchorId="2D8A51CF" wp14:editId="6BC3E37C">
             <wp:extent cx="6108042" cy="5969000"/>
             <wp:effectExtent l="0" t="0" r="7620" b="0"/>
-            <wp:docPr id="2034277609" name="Picture 5"/>
+            <wp:docPr id="538882920" name="Picture 5"/>
             <wp:cNvGraphicFramePr>
               <a:graphicFrameLocks xmlns:a="http://schemas.openxmlformats.org/drawingml/2006/main" noChangeAspect="1"/>
             </wp:cNvGraphicFramePr>
@@ -2102,7 +2102,7 @@
               <a:graphicData uri="http://schemas.openxmlformats.org/drawingml/2006/picture">
                 <pic:pic xmlns:pic="http://schemas.openxmlformats.org/drawingml/2006/picture">
                   <pic:nvPicPr>
-                    <pic:cNvPr id="2034277609" name=""/>
+                    <pic:cNvPr id="538882920" name=""/>
                     <pic:cNvPicPr/>
                   </pic:nvPicPr>
                   <pic:blipFill>
@@ -2207,10 +2207,10 @@
           <w:noProof/>
         </w:rPr>
         <w:drawing>
-          <wp:inline distT="0" distB="0" distL="0" distR="0" wp14:anchorId="2A9D15B4" wp14:editId="52FBCFD5">
+          <wp:inline distT="0" distB="0" distL="0" distR="0" wp14:anchorId="6F000B46" wp14:editId="1A89F11A">
             <wp:extent cx="6332220" cy="3206750"/>
             <wp:effectExtent l="0" t="0" r="0" b="0"/>
-            <wp:docPr id="2089292061" name="Picture 6"/>
+            <wp:docPr id="387132781" name="Picture 6"/>
             <wp:cNvGraphicFramePr>
               <a:graphicFrameLocks xmlns:a="http://schemas.openxmlformats.org/drawingml/2006/main" noChangeAspect="1"/>
             </wp:cNvGraphicFramePr>
@@ -2218,7 +2218,7 @@
               <a:graphicData uri="http://schemas.openxmlformats.org/drawingml/2006/picture">
                 <pic:pic xmlns:pic="http://schemas.openxmlformats.org/drawingml/2006/picture">
                   <pic:nvPicPr>
-                    <pic:cNvPr id="2089292061" name=""/>
+                    <pic:cNvPr id="387132781" name=""/>
                     <pic:cNvPicPr/>
                   </pic:nvPicPr>
                   <pic:blipFill>
@@ -2377,10 +2377,10 @@
         </w:rPr>
         <w:lastRenderedPageBreak/>
         <w:drawing>
-          <wp:inline distT="0" distB="0" distL="0" distR="0" wp14:anchorId="3C720FCD" wp14:editId="1D7B5321">
+          <wp:inline distT="0" distB="0" distL="0" distR="0" wp14:anchorId="34C175A9" wp14:editId="46DF873B">
             <wp:extent cx="5133052" cy="5969000"/>
             <wp:effectExtent l="19050" t="19050" r="10795" b="12700"/>
-            <wp:docPr id="28472015" name="Picture 7"/>
+            <wp:docPr id="1996910591" name="Picture 7"/>
             <wp:cNvGraphicFramePr>
               <a:graphicFrameLocks xmlns:a="http://schemas.openxmlformats.org/drawingml/2006/main" noChangeAspect="1"/>
             </wp:cNvGraphicFramePr>
@@ -2388,7 +2388,7 @@
               <a:graphicData uri="http://schemas.openxmlformats.org/drawingml/2006/picture">
                 <pic:pic xmlns:pic="http://schemas.openxmlformats.org/drawingml/2006/picture">
                   <pic:nvPicPr>
-                    <pic:cNvPr id="28472015" name=""/>
+                    <pic:cNvPr id="1996910591" name=""/>
                     <pic:cNvPicPr/>
                   </pic:nvPicPr>
                   <pic:blipFill>
@@ -2480,10 +2480,10 @@
         </w:rPr>
         <w:lastRenderedPageBreak/>
         <w:drawing>
-          <wp:inline distT="0" distB="0" distL="0" distR="0" wp14:anchorId="24044907" wp14:editId="4211F014">
+          <wp:inline distT="0" distB="0" distL="0" distR="0" wp14:anchorId="4107C709" wp14:editId="4203B370">
             <wp:extent cx="6332220" cy="2038350"/>
             <wp:effectExtent l="19050" t="19050" r="11430" b="19050"/>
-            <wp:docPr id="1209622313" name="Picture 8"/>
+            <wp:docPr id="1348236840" name="Picture 8"/>
             <wp:cNvGraphicFramePr>
               <a:graphicFrameLocks xmlns:a="http://schemas.openxmlformats.org/drawingml/2006/main" noChangeAspect="1"/>
             </wp:cNvGraphicFramePr>
@@ -2491,7 +2491,7 @@
               <a:graphicData uri="http://schemas.openxmlformats.org/drawingml/2006/picture">
                 <pic:pic xmlns:pic="http://schemas.openxmlformats.org/drawingml/2006/picture">
                   <pic:nvPicPr>
-                    <pic:cNvPr id="1209622313" name=""/>
+                    <pic:cNvPr id="1348236840" name=""/>
                     <pic:cNvPicPr/>
                   </pic:nvPicPr>
                   <pic:blipFill>
@@ -2582,10 +2582,10 @@
           <w:noProof/>
         </w:rPr>
         <w:drawing>
-          <wp:inline distT="0" distB="0" distL="0" distR="0" wp14:anchorId="5709386C" wp14:editId="37D4DEB6">
+          <wp:inline distT="0" distB="0" distL="0" distR="0" wp14:anchorId="27D3B5EB" wp14:editId="5EF6CA58">
             <wp:extent cx="6332220" cy="4066540"/>
             <wp:effectExtent l="19050" t="19050" r="11430" b="10160"/>
-            <wp:docPr id="1337494158" name="Picture 9"/>
+            <wp:docPr id="530504918" name="Picture 9"/>
             <wp:cNvGraphicFramePr>
               <a:graphicFrameLocks xmlns:a="http://schemas.openxmlformats.org/drawingml/2006/main" noChangeAspect="1"/>
             </wp:cNvGraphicFramePr>
@@ -2593,7 +2593,7 @@
               <a:graphicData uri="http://schemas.openxmlformats.org/drawingml/2006/picture">
                 <pic:pic xmlns:pic="http://schemas.openxmlformats.org/drawingml/2006/picture">
                   <pic:nvPicPr>
-                    <pic:cNvPr id="1337494158" name=""/>
+                    <pic:cNvPr id="530504918" name=""/>
                     <pic:cNvPicPr/>
                   </pic:nvPicPr>
                   <pic:blipFill>
@@ -2685,10 +2685,10 @@
         </w:rPr>
         <w:lastRenderedPageBreak/>
         <w:drawing>
-          <wp:inline distT="0" distB="0" distL="0" distR="0" wp14:anchorId="42777633" wp14:editId="56FA1BAA">
+          <wp:inline distT="0" distB="0" distL="0" distR="0" wp14:anchorId="114C827C" wp14:editId="0B838807">
             <wp:extent cx="6332220" cy="2994660"/>
             <wp:effectExtent l="19050" t="19050" r="11430" b="15240"/>
-            <wp:docPr id="1060347175" name="Picture 10"/>
+            <wp:docPr id="800084692" name="Picture 10"/>
             <wp:cNvGraphicFramePr>
               <a:graphicFrameLocks xmlns:a="http://schemas.openxmlformats.org/drawingml/2006/main" noChangeAspect="1"/>
             </wp:cNvGraphicFramePr>
@@ -2696,7 +2696,7 @@
               <a:graphicData uri="http://schemas.openxmlformats.org/drawingml/2006/picture">
                 <pic:pic xmlns:pic="http://schemas.openxmlformats.org/drawingml/2006/picture">
                   <pic:nvPicPr>
-                    <pic:cNvPr id="1060347175" name=""/>
+                    <pic:cNvPr id="800084692" name=""/>
                     <pic:cNvPicPr/>
                   </pic:nvPicPr>
                   <pic:blipFill>
@@ -2788,10 +2788,10 @@
         </w:rPr>
         <w:lastRenderedPageBreak/>
         <w:drawing>
-          <wp:inline distT="0" distB="0" distL="0" distR="0" wp14:anchorId="3295CC37" wp14:editId="34438FFC">
+          <wp:inline distT="0" distB="0" distL="0" distR="0" wp14:anchorId="7FBA6F61" wp14:editId="653485AD">
             <wp:extent cx="6332220" cy="5707380"/>
             <wp:effectExtent l="19050" t="19050" r="11430" b="26670"/>
-            <wp:docPr id="266356795" name="Picture 11"/>
+            <wp:docPr id="1075470066" name="Picture 11"/>
             <wp:cNvGraphicFramePr>
               <a:graphicFrameLocks xmlns:a="http://schemas.openxmlformats.org/drawingml/2006/main" noChangeAspect="1"/>
             </wp:cNvGraphicFramePr>
@@ -2799,7 +2799,7 @@
               <a:graphicData uri="http://schemas.openxmlformats.org/drawingml/2006/picture">
                 <pic:pic xmlns:pic="http://schemas.openxmlformats.org/drawingml/2006/picture">
                   <pic:nvPicPr>
-                    <pic:cNvPr id="266356795" name=""/>
+                    <pic:cNvPr id="1075470066" name=""/>
                     <pic:cNvPicPr/>
                   </pic:nvPicPr>
                   <pic:blipFill>
@@ -2891,10 +2891,10 @@
         </w:rPr>
         <w:lastRenderedPageBreak/>
         <w:drawing>
-          <wp:inline distT="0" distB="0" distL="0" distR="0" wp14:anchorId="3EF5FA3A" wp14:editId="6B24AA4F">
+          <wp:inline distT="0" distB="0" distL="0" distR="0" wp14:anchorId="2435AEE7" wp14:editId="357CB936">
             <wp:extent cx="6332220" cy="2750820"/>
             <wp:effectExtent l="19050" t="19050" r="11430" b="11430"/>
-            <wp:docPr id="470438852" name="Picture 12"/>
+            <wp:docPr id="513519532" name="Picture 12"/>
             <wp:cNvGraphicFramePr>
               <a:graphicFrameLocks xmlns:a="http://schemas.openxmlformats.org/drawingml/2006/main" noChangeAspect="1"/>
             </wp:cNvGraphicFramePr>
@@ -2902,7 +2902,7 @@
               <a:graphicData uri="http://schemas.openxmlformats.org/drawingml/2006/picture">
                 <pic:pic xmlns:pic="http://schemas.openxmlformats.org/drawingml/2006/picture">
                   <pic:nvPicPr>
-                    <pic:cNvPr id="470438852" name=""/>
+                    <pic:cNvPr id="513519532" name=""/>
                     <pic:cNvPicPr/>
                   </pic:nvPicPr>
                   <pic:blipFill>
@@ -5849,10 +5849,10 @@
         <w:tblLook w:val="04A0" w:firstRow="1" w:lastRow="0" w:firstColumn="1" w:lastColumn="0" w:noHBand="0" w:noVBand="1"/>
       </w:tblPr>
       <w:tblGrid>
-        <w:gridCol w:w="2144"/>
-        <w:gridCol w:w="2031"/>
-        <w:gridCol w:w="1459"/>
-        <w:gridCol w:w="4346"/>
+        <w:gridCol w:w="2062"/>
+        <w:gridCol w:w="2417"/>
+        <w:gridCol w:w="1427"/>
+        <w:gridCol w:w="4074"/>
       </w:tblGrid>
       <w:tr>
         <w:trPr>
@@ -5861,7 +5861,7 @@
         </w:trPr>
         <w:tc>
           <w:tcPr>
-            <w:tcW w:w="2144" w:type="dxa"/>
+            <w:tcW w:w="2062" w:type="dxa"/>
             <w:shd w:val="clear" w:color="auto" w:fill="E6E6E6"/>
           </w:tcPr>
           <w:p>
@@ -5884,7 +5884,7 @@
         </w:tc>
         <w:tc>
           <w:tcPr>
-            <w:tcW w:w="2031" w:type="dxa"/>
+            <w:tcW w:w="2417" w:type="dxa"/>
             <w:shd w:val="clear" w:color="auto" w:fill="E6E6E6"/>
           </w:tcPr>
           <w:p>
@@ -5907,7 +5907,7 @@
         </w:tc>
         <w:tc>
           <w:tcPr>
-            <w:tcW w:w="1459" w:type="dxa"/>
+            <w:tcW w:w="1427" w:type="dxa"/>
             <w:shd w:val="clear" w:color="auto" w:fill="E6E6E6"/>
           </w:tcPr>
           <w:p>
@@ -5930,7 +5930,7 @@
         </w:tc>
         <w:tc>
           <w:tcPr>
-            <w:tcW w:w="4346" w:type="dxa"/>
+            <w:tcW w:w="4074" w:type="dxa"/>
             <w:shd w:val="clear" w:color="auto" w:fill="E6E6E6"/>
           </w:tcPr>
           <w:p>
@@ -5958,7 +5958,7 @@
         </w:trPr>
         <w:tc>
           <w:tcPr>
-            <w:tcW w:w="2144" w:type="dxa"/>
+            <w:tcW w:w="2062" w:type="dxa"/>
           </w:tcPr>
           <w:p>
             <w:pPr>
@@ -5978,7 +5978,7 @@
         </w:tc>
         <w:tc>
           <w:tcPr>
-            <w:tcW w:w="2031" w:type="dxa"/>
+            <w:tcW w:w="2417" w:type="dxa"/>
           </w:tcPr>
           <w:p>
             <w:pPr>
@@ -5992,13 +5992,13 @@
               <w:rPr>
                 <w:sz w:val="20"/>
               </w:rPr>
-              <w:t>Gedion / Gedion Basson</w:t>
+              <w:t>Cyber-4</w:t>
             </w:r>
           </w:p>
         </w:tc>
         <w:tc>
           <w:tcPr>
-            <w:tcW w:w="1459" w:type="dxa"/>
+            <w:tcW w:w="1427" w:type="dxa"/>
           </w:tcPr>
           <w:p>
             <w:pPr>
@@ -6018,7 +6018,7 @@
         </w:tc>
         <w:tc>
           <w:tcPr>
-            <w:tcW w:w="4346" w:type="dxa"/>
+            <w:tcW w:w="4074" w:type="dxa"/>
           </w:tcPr>
           <w:p>
             <w:pPr>
@@ -6043,7 +6043,7 @@
         </w:trPr>
         <w:tc>
           <w:tcPr>
-            <w:tcW w:w="2144" w:type="dxa"/>
+            <w:tcW w:w="2062" w:type="dxa"/>
           </w:tcPr>
           <w:p>
             <w:pPr>
@@ -6063,7 +6063,7 @@
         </w:tc>
         <w:tc>
           <w:tcPr>
-            <w:tcW w:w="2031" w:type="dxa"/>
+            <w:tcW w:w="2417" w:type="dxa"/>
           </w:tcPr>
           <w:p>
             <w:pPr>
@@ -6077,13 +6077,13 @@
               <w:rPr>
                 <w:sz w:val="20"/>
               </w:rPr>
-              <w:t>Moe</w:t>
+              <w:t>Noobey32 (repository owner)</w:t>
             </w:r>
           </w:p>
         </w:tc>
         <w:tc>
           <w:tcPr>
-            <w:tcW w:w="1459" w:type="dxa"/>
+            <w:tcW w:w="1427" w:type="dxa"/>
           </w:tcPr>
           <w:p>
             <w:pPr>
@@ -6103,7 +6103,7 @@
         </w:tc>
         <w:tc>
           <w:tcPr>
-            <w:tcW w:w="4346" w:type="dxa"/>
+            <w:tcW w:w="4074" w:type="dxa"/>
           </w:tcPr>
           <w:p>
             <w:pPr>
@@ -6128,7 +6128,7 @@
         </w:trPr>
         <w:tc>
           <w:tcPr>
-            <w:tcW w:w="2144" w:type="dxa"/>
+            <w:tcW w:w="2062" w:type="dxa"/>
           </w:tcPr>
           <w:p>
             <w:pPr>
@@ -6148,7 +6148,7 @@
         </w:tc>
         <w:tc>
           <w:tcPr>
-            <w:tcW w:w="2031" w:type="dxa"/>
+            <w:tcW w:w="2417" w:type="dxa"/>
           </w:tcPr>
           <w:p>
             <w:pPr>
@@ -6168,7 +6168,7 @@
         </w:tc>
         <w:tc>
           <w:tcPr>
-            <w:tcW w:w="1459" w:type="dxa"/>
+            <w:tcW w:w="1427" w:type="dxa"/>
           </w:tcPr>
           <w:p>
             <w:pPr>
@@ -6188,7 +6188,7 @@
         </w:tc>
         <w:tc>
           <w:tcPr>
-            <w:tcW w:w="4346" w:type="dxa"/>
+            <w:tcW w:w="4074" w:type="dxa"/>
           </w:tcPr>
           <w:p>
             <w:pPr>
@@ -6213,7 +6213,7 @@
         </w:trPr>
         <w:tc>
           <w:tcPr>
-            <w:tcW w:w="2144" w:type="dxa"/>
+            <w:tcW w:w="2062" w:type="dxa"/>
           </w:tcPr>
           <w:p>
             <w:pPr>
@@ -6232,7 +6232,7 @@
         </w:tc>
         <w:tc>
           <w:tcPr>
-            <w:tcW w:w="2031" w:type="dxa"/>
+            <w:tcW w:w="2417" w:type="dxa"/>
           </w:tcPr>
           <w:p>
             <w:pPr>
@@ -6245,13 +6245,13 @@
               <w:rPr>
                 <w:sz w:val="20"/>
               </w:rPr>
-              <w:t>Sihle Kayise / sihle588</w:t>
+              <w:t>sihle588</w:t>
             </w:r>
           </w:p>
         </w:tc>
         <w:tc>
           <w:tcPr>
-            <w:tcW w:w="1459" w:type="dxa"/>
+            <w:tcW w:w="1427" w:type="dxa"/>
           </w:tcPr>
           <w:p>
             <w:pPr>
@@ -6270,7 +6270,7 @@
         </w:tc>
         <w:tc>
           <w:tcPr>
-            <w:tcW w:w="4346" w:type="dxa"/>
+            <w:tcW w:w="4074" w:type="dxa"/>
           </w:tcPr>
           <w:p>
             <w:pPr>
@@ -6300,10 +6300,10 @@
           <w:noProof/>
         </w:rPr>
         <w:drawing>
-          <wp:inline distT="0" distB="0" distL="0" distR="0" wp14:anchorId="130E8697" wp14:editId="22479539">
+          <wp:inline distT="0" distB="0" distL="0" distR="0" wp14:anchorId="30DC441F" wp14:editId="6FB59722">
             <wp:extent cx="6332220" cy="1897380"/>
             <wp:effectExtent l="19050" t="19050" r="11430" b="26670"/>
-            <wp:docPr id="107012159" name="Picture 13"/>
+            <wp:docPr id="1048295987" name="Picture 13"/>
             <wp:cNvGraphicFramePr>
               <a:graphicFrameLocks xmlns:a="http://schemas.openxmlformats.org/drawingml/2006/main" noChangeAspect="1"/>
             </wp:cNvGraphicFramePr>
@@ -6311,7 +6311,7 @@
               <a:graphicData uri="http://schemas.openxmlformats.org/drawingml/2006/picture">
                 <pic:pic xmlns:pic="http://schemas.openxmlformats.org/drawingml/2006/picture">
                   <pic:nvPicPr>
-                    <pic:cNvPr id="107012159" name=""/>
+                    <pic:cNvPr id="1048295987" name=""/>
                     <pic:cNvPicPr/>
                   </pic:nvPicPr>
                   <pic:blipFill>

</xml_diff>